<commit_message>
Snapshot GreenRAN article-alignment and SAC conflict collection state
</commit_message>
<xml_diff>
--- a/docs/Relatorio-GreenRAN-Conflitos.docx
+++ b/docs/Relatorio-GreenRAN-Conflitos.docx
@@ -4,12 +4,12 @@
   <w:body>
     <w:p>
       <w:r>
-        <w:t xml:space="preserve"># RELATORIO FINAL - GreenRAN: Conflitos Multi-xApp em O-RAN usando GraphSAGE</w:t>
-      </w:r>
-    </w:p>
-    <w:p>
-      <w:r>
-        <w:t xml:space="preserve">## Fechamento experimental com protocolo alinhado ao ARTICLE00 e pacote hibrido final 10/10</w:t>
+        <w:t xml:space="preserve"># RELATORIO FINAL - GreenRAN: Conflitos Multi-xApp em O-RAN usando EE-DRL-GreenRAN e ARMD-GreenRAN</w:t>
+      </w:r>
+    </w:p>
+    <w:p>
+      <w:r>
+        <w:t xml:space="preserve">## Fechamento experimental com protocolo DRL proprio, alinhamento ao ARTICLE00 e pacote hibrido final 10/10</w:t>
       </w:r>
     </w:p>
     <w:p>
@@ -19,7 +19,7 @@
     </w:p>
     <w:p>
       <w:r>
-        <w:t xml:space="preserve">**Data:** 16 de maio de 2026</w:t>
+        <w:t xml:space="preserve">**Data:** 17 de maio de 2026</w:t>
       </w:r>
     </w:p>
     <w:p>
@@ -549,6 +549,51 @@
     </w:p>
     <w:p>
       <w:r>
+        <w:t xml:space="preserve">### 6.3 Pacote oficial EE-DRL-GreenRAN</w:t>
+      </w:r>
+    </w:p>
+    <w:p>
+      <w:r>
+        <w:t xml:space="preserve">- Nome oficial da trilha DRL: `EE-DRL-GreenRAN`.</w:t>
+      </w:r>
+    </w:p>
+    <w:p>
+      <w:r>
+        <w:t xml:space="preserve">- Total de figuras organizadas no pacote DRL: `9`.</w:t>
+      </w:r>
+    </w:p>
+    <w:p>
+      <w:r>
+        <w:t xml:space="preserve">- Total de artefatos organizados no pacote DRL: `7`.</w:t>
+      </w:r>
+    </w:p>
+    <w:p>
+      <w:r>
+        <w:t xml:space="preserve">- Figuras equivalentes ao paper DRL: arquitetura `0` e quantitativas `0`.</w:t>
+      </w:r>
+    </w:p>
+    <w:p>
+      <w:r>
+        <w:t xml:space="preserve">- `runs/eedrl_greenran_final/eedrl_greenran_summary.json`</w:t>
+      </w:r>
+    </w:p>
+    <w:p>
+      <w:r>
+        <w:t xml:space="preserve">- `runs/eedrl_greenran_final/eedrl_greenran_summary.md`</w:t>
+      </w:r>
+    </w:p>
+    <w:p>
+      <w:r>
+        <w:t xml:space="preserve">- `runs/eedrl_greenran_final/paper_figures/paper_figures_summary.json`</w:t>
+      </w:r>
+    </w:p>
+    <w:p>
+      <w:r>
+        <w:t xml:space="preserve">- `runs/eedrl_greenran_final/paper_figures/paper_figures_summary.md`</w:t>
+      </w:r>
+    </w:p>
+    <w:p>
+      <w:r>
         <w:t xml:space="preserve">---</w:t>
       </w:r>
     </w:p>
@@ -559,7 +604,7 @@
     </w:p>
     <w:p>
       <w:r>
-        <w:t xml:space="preserve">O GreenRAN encerrou esta fase com uma base experimental limpa, um pacote hibrido reproduzivel e compatibilidade metodologica com o `ARTICLE00`. O resultado final relevante para o projeto e que os conflitos diretos, implicitos, indiretos e de reconstrucao puderam ser aprendidos e validados com `F1 = 1.0` em todos os dez cenarios finais no `epoch 200`.</w:t>
+        <w:t xml:space="preserve">O GreenRAN encerrou esta fase com uma base experimental limpa, um pacote hibrido reproduzivel e compatibilidade metodologica com o `ARTICLE00`, alem de uma trilha DRL organizada como `EE-DRL-GreenRAN`. O resultado final relevante para o projeto e que os conflitos diretos, implicitos, indiretos e de reconstrucao puderam ser aprendidos e validados com `F1 = 1.0` em todos os dez cenarios finais no `epoch 200`.</w:t>
       </w:r>
     </w:p>
     <w:p>

</xml_diff>